<commit_message>
Build is Itch Ready
Removed the last few debug messages, ready for itch
</commit_message>
<xml_diff>
--- a/Build/Sir Dingus Things to Fix.docx
+++ b/Build/Sir Dingus Things to Fix.docx
@@ -45,16 +45,28 @@
           <w:ilvl w:val="0"/>
           <w:numId w:val="1"/>
         </w:numPr>
-      </w:pPr>
-      <w:r>
+        <w:rPr>
+          <w:strike/>
+        </w:rPr>
+      </w:pPr>
+      <w:r>
+        <w:rPr>
+          <w:strike/>
+        </w:rPr>
         <w:t xml:space="preserve">AI that </w:t>
       </w:r>
       <w:proofErr w:type="gramStart"/>
       <w:r>
+        <w:rPr>
+          <w:strike/>
+        </w:rPr>
         <w:t>die</w:t>
       </w:r>
       <w:proofErr w:type="gramEnd"/>
       <w:r>
+        <w:rPr>
+          <w:strike/>
+        </w:rPr>
         <w:t xml:space="preserve"> during travel do not lose their focus nor stop moving towards their destination</w:t>
       </w:r>
     </w:p>
@@ -85,28 +97,49 @@
           <w:ilvl w:val="0"/>
           <w:numId w:val="2"/>
         </w:numPr>
-      </w:pPr>
-      <w:r>
+        <w:rPr>
+          <w:strike/>
+        </w:rPr>
+      </w:pPr>
+      <w:r>
+        <w:rPr>
+          <w:strike/>
+        </w:rPr>
         <w:t xml:space="preserve">Client players’ </w:t>
       </w:r>
       <w:proofErr w:type="spellStart"/>
       <w:r>
+        <w:rPr>
+          <w:strike/>
+        </w:rPr>
         <w:t>bAlive</w:t>
       </w:r>
       <w:proofErr w:type="spellEnd"/>
       <w:r>
+        <w:rPr>
+          <w:strike/>
+        </w:rPr>
         <w:t xml:space="preserve"> </w:t>
       </w:r>
       <w:proofErr w:type="spellStart"/>
       <w:r>
+        <w:rPr>
+          <w:strike/>
+        </w:rPr>
         <w:t>boolean</w:t>
       </w:r>
       <w:proofErr w:type="spellEnd"/>
       <w:r>
+        <w:rPr>
+          <w:strike/>
+        </w:rPr>
         <w:t xml:space="preserve"> sometimes seems to be both true and false, leading to strange behaviour on </w:t>
       </w:r>
       <w:proofErr w:type="gramStart"/>
       <w:r>
+        <w:rPr>
+          <w:strike/>
+        </w:rPr>
         <w:t>death</w:t>
       </w:r>
       <w:proofErr w:type="gramEnd"/>
@@ -120,10 +153,7 @@
         </w:numPr>
       </w:pPr>
       <w:r>
-        <w:t xml:space="preserve">Dodge Roll </w:t>
-      </w:r>
-      <w:r>
-        <w:t xml:space="preserve">has no mechanical purpose at the </w:t>
+        <w:t xml:space="preserve">Dodge Roll has no mechanical purpose at the </w:t>
       </w:r>
       <w:proofErr w:type="gramStart"/>
       <w:r>

</xml_diff>